<commit_message>
Upadte the project and Internship progress
</commit_message>
<xml_diff>
--- a/Project/Weekly_Report_Week1.docx
+++ b/Project/Weekly_Report_Week1.docx
@@ -27,23 +27,7 @@
           <w:sz w:val="20"/>
           <w:szCs w:val="20"/>
         </w:rPr>
-        <w:t>Opp. Science city, Sola-</w:t>
-      </w:r>
-      <w:proofErr w:type="spellStart"/>
-      <w:r>
-        <w:rPr>
-          <w:sz w:val="20"/>
-          <w:szCs w:val="20"/>
-        </w:rPr>
-        <w:t>Bhadaj</w:t>
-      </w:r>
-      <w:proofErr w:type="spellEnd"/>
-      <w:r>
-        <w:rPr>
-          <w:sz w:val="20"/>
-          <w:szCs w:val="20"/>
-        </w:rPr>
-        <w:t xml:space="preserve"> Road, Ahmedabad, Gujarat 380060</w:t>
+        <w:t>Opp. Science city, Sola-Bhadaj Road, Ahmedabad, Gujarat 380060</w:t>
       </w:r>
     </w:p>
     <w:p>
@@ -172,21 +156,12 @@
             </w:tcMar>
           </w:tcPr>
           <w:p>
-            <w:proofErr w:type="spellStart"/>
             <w:r>
               <w:rPr>
                 <w:b/>
                 <w:bCs/>
               </w:rPr>
-              <w:t>Enrollment</w:t>
-            </w:r>
-            <w:proofErr w:type="spellEnd"/>
-            <w:r>
-              <w:rPr>
-                <w:b/>
-                <w:bCs/>
-              </w:rPr>
-              <w:t xml:space="preserve"> Number:</w:t>
+              <w:t>Enrollment Number:</w:t>
             </w:r>
           </w:p>
         </w:tc>
@@ -326,15 +301,7 @@
           </w:tcPr>
           <w:p>
             <w:r>
-              <w:t xml:space="preserve">Microsoft Elevate Program (via </w:t>
-            </w:r>
-            <w:proofErr w:type="spellStart"/>
-            <w:r>
-              <w:t>Edunet</w:t>
-            </w:r>
-            <w:proofErr w:type="spellEnd"/>
-            <w:r>
-              <w:t xml:space="preserve"> Foundation &amp; FICE Education)</w:t>
+              <w:t>Microsoft Elevate Program (via Edunet Foundation &amp; FICE Education)</w:t>
             </w:r>
           </w:p>
         </w:tc>
@@ -910,15 +877,7 @@
         <w:spacing w:after="100"/>
       </w:pPr>
       <w:r>
-        <w:t xml:space="preserve">Reviewed GTU internship problem statements for 8th semester. </w:t>
-      </w:r>
-      <w:proofErr w:type="spellStart"/>
-      <w:r>
-        <w:t>Analyzed</w:t>
-      </w:r>
-      <w:proofErr w:type="spellEnd"/>
-      <w:r>
-        <w:t xml:space="preserve"> "Border Defence and Surveillance" domain as potential project area. Studied the challenges mentioned in problem statement:</w:t>
+        <w:t>Reviewed GTU internship problem statements for 8th semester. Analyzed "Border Defence and Surveillance" domain as potential project area. Studied the challenges mentioned in problem statement:</w:t>
       </w:r>
     </w:p>
     <w:p>
@@ -1070,33 +1029,20 @@
           <w:numId w:val="2"/>
         </w:numPr>
       </w:pPr>
-      <w:proofErr w:type="spellStart"/>
-      <w:r>
-        <w:t>Jupyter</w:t>
-      </w:r>
-      <w:proofErr w:type="spellEnd"/>
-      <w:r>
-        <w:t xml:space="preserve"> Notebook for interactive analysis</w:t>
-      </w:r>
-    </w:p>
-    <w:p>
-      <w:pPr>
-        <w:pStyle w:val="ListParagraph"/>
-        <w:numPr>
-          <w:ilvl w:val="0"/>
-          <w:numId w:val="2"/>
-        </w:numPr>
-      </w:pPr>
-      <w:r>
-        <w:t xml:space="preserve">Basic libraries: </w:t>
-      </w:r>
-      <w:proofErr w:type="spellStart"/>
-      <w:r>
-        <w:t>numpy</w:t>
-      </w:r>
-      <w:proofErr w:type="spellEnd"/>
-      <w:r>
-        <w:t>, pandas, matplotlib (testing installation)</w:t>
+      <w:r>
+        <w:t>Jupyter Notebook for interactive analysis</w:t>
+      </w:r>
+    </w:p>
+    <w:p>
+      <w:pPr>
+        <w:pStyle w:val="ListParagraph"/>
+        <w:numPr>
+          <w:ilvl w:val="0"/>
+          <w:numId w:val="2"/>
+        </w:numPr>
+      </w:pPr>
+      <w:r>
+        <w:t>Basic libraries: numpy, pandas, matplotlib (testing installation)</w:t>
       </w:r>
     </w:p>
     <w:p/>
@@ -1109,7 +1055,7 @@
           <w:noProof/>
         </w:rPr>
         <w:drawing>
-          <wp:inline distT="0" distB="0" distL="0" distR="0" wp14:anchorId="65FE9F01" wp14:editId="0B3D8A32">
+          <wp:inline distT="0" distB="0" distL="0" distR="0" wp14:anchorId="65FE9F01" wp14:editId="5A23110D">
             <wp:extent cx="5753100" cy="4505981"/>
             <wp:effectExtent l="0" t="0" r="0" b="8890"/>
             <wp:docPr id="1298570163" name="Picture 3"/>
@@ -1181,7 +1127,7 @@
       </w:pPr>
       <w:r>
         <w:lastRenderedPageBreak/>
-        <w:t>Plans for next week (Feb 3-8, 2026):</w:t>
+        <w:t>Plans for next week:</w:t>
       </w:r>
     </w:p>
     <w:p>
@@ -1288,15 +1234,7 @@
         </w:numPr>
       </w:pPr>
       <w:r>
-        <w:t xml:space="preserve">Identify public datasets for training (UCF-Crime, </w:t>
-      </w:r>
-      <w:proofErr w:type="spellStart"/>
-      <w:r>
-        <w:t>xView</w:t>
-      </w:r>
-      <w:proofErr w:type="spellEnd"/>
-      <w:r>
-        <w:t>, etc.)</w:t>
+        <w:t>Identify public datasets for training (UCF-Crime, xView, etc.)</w:t>
       </w:r>
     </w:p>
     <w:p>

</xml_diff>